<commit_message>
NKTC: chuẩn hóa thể thức mẫu công văn gửi thuế
</commit_message>
<xml_diff>
--- a/nktc/assets/CVNK_Gui_thue_template.docx
+++ b/nktc/assets/CVNK_Gui_thue_template.docx
@@ -203,7 +203,7 @@
                 <w:between w:space="0" w:sz="0" w:val="nil"/>
               </w:pBdr>
               <w:shd w:fill="auto" w:val="clear"/>
-              <w:spacing w:after="0" w:before="0" w:line="360" w:lineRule="auto"/>
+              <w:spacing w:after="0" w:before="0" w:line="240" w:lineRule="auto"/>
               <w:ind w:left="0" w:right="0" w:firstLine="0"/>
               <w:jc w:val="center"/>
               <w:rPr>
@@ -247,12 +247,12 @@
               <w:pBdr>
                 <w:top w:space="0" w:sz="0" w:val="nil"/>
                 <w:left w:space="0" w:sz="0" w:val="nil"/>
-                <w:bottom w:space="1" w:sz="6" w:val="single" w:color="000000"/>
+                <w:bottom w:space="2" w:sz="6" w:val="single" w:color="000000"/>
                 <w:right w:space="0" w:sz="0" w:val="nil"/>
                 <w:between w:space="0" w:sz="0" w:val="nil"/>
               </w:pBdr>
               <w:spacing w:after="0" w:before="0" w:line="20" w:lineRule="auto"/>
-              <w:ind w:left="1145" w:right="1145" w:firstLine="0"/>
+              <w:ind w:left="1375" w:right="1375" w:firstLine="0"/>
               <w:jc w:val="center"/>
               <w:rPr>
                 <w:rFonts w:ascii="Times New Roman" w:hAnsi="Times New Roman"/>
@@ -260,6 +260,14 @@
                 <w:szCs w:val="2"/>
               </w:rPr>
             </w:pPr>
+            <w:r>
+              <w:rPr>
+                <w:rFonts w:ascii="Times New Roman" w:hAnsi="Times New Roman"/>
+                <w:sz w:val="2"/>
+                <w:szCs w:val="2"/>
+              </w:rPr>
+              <w:t xml:space="preserve"> </w:t>
+            </w:r>
           </w:p>
           <w:p>
             <w:pPr>
@@ -364,7 +372,7 @@
               <w:tabs>
                 <w:tab w:val="center" w:leader="none" w:pos="1620"/>
               </w:tabs>
-              <w:spacing w:after="0" w:before="0" w:line="360" w:lineRule="auto"/>
+              <w:spacing w:after="0" w:before="0" w:line="240" w:lineRule="auto"/>
               <w:ind w:left="0" w:right="0" w:firstLine="0"/>
               <w:jc w:val="center"/>
               <w:rPr>
@@ -408,12 +416,12 @@
               <w:pBdr>
                 <w:top w:space="0" w:sz="0" w:val="nil"/>
                 <w:left w:space="0" w:sz="0" w:val="nil"/>
-                <w:bottom w:space="4" w:sz="6" w:val="single" w:color="000000"/>
+                <w:bottom w:space="2" w:sz="6" w:val="single" w:color="000000"/>
                 <w:right w:space="0" w:sz="0" w:val="nil"/>
                 <w:between w:space="0" w:sz="0" w:val="nil"/>
               </w:pBdr>
               <w:spacing w:after="0" w:before="0" w:line="20" w:lineRule="auto"/>
-              <w:ind w:left="1102" w:right="1102" w:firstLine="0"/>
+              <w:ind w:left="1268" w:right="1268" w:firstLine="0"/>
               <w:jc w:val="center"/>
               <w:rPr>
                 <w:rFonts w:ascii="Times New Roman" w:hAnsi="Times New Roman"/>
@@ -421,6 +429,14 @@
                 <w:szCs w:val="2"/>
               </w:rPr>
             </w:pPr>
+            <w:r>
+              <w:rPr>
+                <w:rFonts w:ascii="Times New Roman" w:hAnsi="Times New Roman"/>
+                <w:sz w:val="2"/>
+                <w:szCs w:val="2"/>
+              </w:rPr>
+              <w:t xml:space="preserve"> </w:t>
+            </w:r>
           </w:p>
           <w:p>
             <w:pPr>
@@ -617,12 +633,12 @@
         <w:pBdr>
           <w:top w:space="0" w:sz="0" w:val="nil"/>
           <w:left w:space="0" w:sz="0" w:val="nil"/>
-          <w:bottom w:space="1" w:sz="6" w:val="single" w:color="000000"/>
+          <w:bottom w:space="2" w:sz="6" w:val="single" w:color="000000"/>
           <w:right w:space="0" w:sz="0" w:val="nil"/>
           <w:between w:space="0" w:sz="0" w:val="nil"/>
         </w:pBdr>
         <w:spacing w:after="0" w:before="0" w:line="20" w:lineRule="auto"/>
-        <w:ind w:left="3138" w:right="3138" w:firstLine="0"/>
+        <w:ind w:left="3350" w:right="3350" w:firstLine="0"/>
         <w:jc w:val="center"/>
         <w:rPr>
           <w:rFonts w:ascii="Times New Roman" w:hAnsi="Times New Roman"/>
@@ -630,6 +646,14 @@
           <w:szCs w:val="2"/>
         </w:rPr>
       </w:pPr>
+      <w:r>
+        <w:rPr>
+          <w:rFonts w:ascii="Times New Roman" w:hAnsi="Times New Roman"/>
+          <w:sz w:val="2"/>
+          <w:szCs w:val="2"/>
+        </w:rPr>
+        <w:t xml:space="preserve"> </w:t>
+      </w:r>
     </w:p>
     <w:p>
       <w:pPr>
@@ -1497,7 +1521,7 @@
                 <w:between w:space="0" w:sz="0" w:val="nil"/>
               </w:pBdr>
               <w:shd w:fill="auto" w:val="clear"/>
-              <w:spacing w:after="0" w:before="0" w:line="360" w:lineRule="auto"/>
+              <w:spacing w:after="0" w:before="0" w:line="240" w:lineRule="auto"/>
               <w:ind w:left="0" w:right="0" w:firstLine="0"/>
               <w:jc w:val="center"/>
               <w:rPr>
@@ -1541,12 +1565,12 @@
               <w:pBdr>
                 <w:top w:space="0" w:sz="0" w:val="nil"/>
                 <w:left w:space="0" w:sz="0" w:val="nil"/>
-                <w:bottom w:space="1" w:sz="6" w:val="single" w:color="000000"/>
+                <w:bottom w:space="2" w:sz="6" w:val="single" w:color="000000"/>
                 <w:right w:space="0" w:sz="0" w:val="nil"/>
                 <w:between w:space="0" w:sz="0" w:val="nil"/>
               </w:pBdr>
               <w:spacing w:after="0" w:before="0" w:line="20" w:lineRule="auto"/>
-              <w:ind w:left="1145" w:right="1145" w:firstLine="0"/>
+              <w:ind w:left="1375" w:right="1375" w:firstLine="0"/>
               <w:jc w:val="center"/>
               <w:rPr>
                 <w:rFonts w:ascii="Times New Roman" w:hAnsi="Times New Roman"/>
@@ -1554,6 +1578,14 @@
                 <w:szCs w:val="2"/>
               </w:rPr>
             </w:pPr>
+            <w:r>
+              <w:rPr>
+                <w:rFonts w:ascii="Times New Roman" w:hAnsi="Times New Roman"/>
+                <w:sz w:val="2"/>
+                <w:szCs w:val="2"/>
+              </w:rPr>
+              <w:t xml:space="preserve"> </w:t>
+            </w:r>
           </w:p>
           <w:p>
             <w:pPr>
@@ -1658,7 +1690,7 @@
               <w:tabs>
                 <w:tab w:val="center" w:leader="none" w:pos="1620"/>
               </w:tabs>
-              <w:spacing w:after="0" w:before="0" w:line="360" w:lineRule="auto"/>
+              <w:spacing w:after="0" w:before="0" w:line="240" w:lineRule="auto"/>
               <w:ind w:left="0" w:right="0" w:firstLine="0"/>
               <w:jc w:val="center"/>
               <w:rPr>
@@ -1702,12 +1734,12 @@
               <w:pBdr>
                 <w:top w:space="0" w:sz="0" w:val="nil"/>
                 <w:left w:space="0" w:sz="0" w:val="nil"/>
-                <w:bottom w:space="4" w:sz="6" w:val="single" w:color="000000"/>
+                <w:bottom w:space="2" w:sz="6" w:val="single" w:color="000000"/>
                 <w:right w:space="0" w:sz="0" w:val="nil"/>
                 <w:between w:space="0" w:sz="0" w:val="nil"/>
               </w:pBdr>
               <w:spacing w:after="0" w:before="0" w:line="20" w:lineRule="auto"/>
-              <w:ind w:left="1102" w:right="1102" w:firstLine="0"/>
+              <w:ind w:left="1268" w:right="1268" w:firstLine="0"/>
               <w:jc w:val="center"/>
               <w:rPr>
                 <w:rFonts w:ascii="Times New Roman" w:hAnsi="Times New Roman"/>
@@ -1715,6 +1747,14 @@
                 <w:szCs w:val="2"/>
               </w:rPr>
             </w:pPr>
+            <w:r>
+              <w:rPr>
+                <w:rFonts w:ascii="Times New Roman" w:hAnsi="Times New Roman"/>
+                <w:sz w:val="2"/>
+                <w:szCs w:val="2"/>
+              </w:rPr>
+              <w:t xml:space="preserve"> </w:t>
+            </w:r>
           </w:p>
           <w:p>
             <w:pPr>
@@ -1911,12 +1951,12 @@
         <w:pBdr>
           <w:top w:space="0" w:sz="0" w:val="nil"/>
           <w:left w:space="0" w:sz="0" w:val="nil"/>
-          <w:bottom w:space="1" w:sz="6" w:val="single" w:color="000000"/>
+          <w:bottom w:space="2" w:sz="6" w:val="single" w:color="000000"/>
           <w:right w:space="0" w:sz="0" w:val="nil"/>
           <w:between w:space="0" w:sz="0" w:val="nil"/>
         </w:pBdr>
         <w:spacing w:after="0" w:before="0" w:line="20" w:lineRule="auto"/>
-        <w:ind w:left="3138" w:right="3138" w:firstLine="0"/>
+        <w:ind w:left="3350" w:right="3350" w:firstLine="0"/>
         <w:jc w:val="center"/>
         <w:rPr>
           <w:rFonts w:ascii="Times New Roman" w:hAnsi="Times New Roman"/>
@@ -1924,6 +1964,14 @@
           <w:szCs w:val="2"/>
         </w:rPr>
       </w:pPr>
+      <w:r>
+        <w:rPr>
+          <w:rFonts w:ascii="Times New Roman" w:hAnsi="Times New Roman"/>
+          <w:sz w:val="2"/>
+          <w:szCs w:val="2"/>
+        </w:rPr>
+        <w:t xml:space="preserve"> </w:t>
+      </w:r>
     </w:p>
     <w:p>
       <w:pPr>
@@ -2786,7 +2834,7 @@
                 <w:between w:space="0" w:sz="0" w:val="nil"/>
               </w:pBdr>
               <w:shd w:fill="auto" w:val="clear"/>
-              <w:spacing w:after="0" w:before="0" w:line="360" w:lineRule="auto"/>
+              <w:spacing w:after="0" w:before="0" w:line="240" w:lineRule="auto"/>
               <w:ind w:left="0" w:right="0" w:firstLine="0"/>
               <w:jc w:val="center"/>
               <w:rPr>
@@ -2830,12 +2878,12 @@
               <w:pBdr>
                 <w:top w:space="0" w:sz="0" w:val="nil"/>
                 <w:left w:space="0" w:sz="0" w:val="nil"/>
-                <w:bottom w:space="1" w:sz="6" w:val="single" w:color="000000"/>
+                <w:bottom w:space="2" w:sz="6" w:val="single" w:color="000000"/>
                 <w:right w:space="0" w:sz="0" w:val="nil"/>
                 <w:between w:space="0" w:sz="0" w:val="nil"/>
               </w:pBdr>
               <w:spacing w:after="0" w:before="0" w:line="20" w:lineRule="auto"/>
-              <w:ind w:left="1145" w:right="1145" w:firstLine="0"/>
+              <w:ind w:left="1375" w:right="1375" w:firstLine="0"/>
               <w:jc w:val="center"/>
               <w:rPr>
                 <w:rFonts w:ascii="Times New Roman" w:hAnsi="Times New Roman"/>
@@ -2843,6 +2891,14 @@
                 <w:szCs w:val="2"/>
               </w:rPr>
             </w:pPr>
+            <w:r>
+              <w:rPr>
+                <w:rFonts w:ascii="Times New Roman" w:hAnsi="Times New Roman"/>
+                <w:sz w:val="2"/>
+                <w:szCs w:val="2"/>
+              </w:rPr>
+              <w:t xml:space="preserve"> </w:t>
+            </w:r>
           </w:p>
           <w:p>
             <w:pPr>
@@ -2947,7 +3003,7 @@
               <w:tabs>
                 <w:tab w:val="center" w:leader="none" w:pos="1620"/>
               </w:tabs>
-              <w:spacing w:after="0" w:before="0" w:line="360" w:lineRule="auto"/>
+              <w:spacing w:after="0" w:before="0" w:line="240" w:lineRule="auto"/>
               <w:ind w:left="0" w:right="0" w:firstLine="0"/>
               <w:jc w:val="center"/>
               <w:rPr>
@@ -2991,12 +3047,12 @@
               <w:pBdr>
                 <w:top w:space="0" w:sz="0" w:val="nil"/>
                 <w:left w:space="0" w:sz="0" w:val="nil"/>
-                <w:bottom w:space="4" w:sz="6" w:val="single" w:color="000000"/>
+                <w:bottom w:space="2" w:sz="6" w:val="single" w:color="000000"/>
                 <w:right w:space="0" w:sz="0" w:val="nil"/>
                 <w:between w:space="0" w:sz="0" w:val="nil"/>
               </w:pBdr>
               <w:spacing w:after="0" w:before="0" w:line="20" w:lineRule="auto"/>
-              <w:ind w:left="1102" w:right="1102" w:firstLine="0"/>
+              <w:ind w:left="1268" w:right="1268" w:firstLine="0"/>
               <w:jc w:val="center"/>
               <w:rPr>
                 <w:rFonts w:ascii="Times New Roman" w:hAnsi="Times New Roman"/>
@@ -3004,6 +3060,14 @@
                 <w:szCs w:val="2"/>
               </w:rPr>
             </w:pPr>
+            <w:r>
+              <w:rPr>
+                <w:rFonts w:ascii="Times New Roman" w:hAnsi="Times New Roman"/>
+                <w:sz w:val="2"/>
+                <w:szCs w:val="2"/>
+              </w:rPr>
+              <w:t xml:space="preserve"> </w:t>
+            </w:r>
           </w:p>
           <w:p>
             <w:pPr>
@@ -3200,12 +3264,12 @@
         <w:pBdr>
           <w:top w:space="0" w:sz="0" w:val="nil"/>
           <w:left w:space="0" w:sz="0" w:val="nil"/>
-          <w:bottom w:space="1" w:sz="6" w:val="single" w:color="000000"/>
+          <w:bottom w:space="2" w:sz="6" w:val="single" w:color="000000"/>
           <w:right w:space="0" w:sz="0" w:val="nil"/>
           <w:between w:space="0" w:sz="0" w:val="nil"/>
         </w:pBdr>
         <w:spacing w:after="0" w:before="0" w:line="20" w:lineRule="auto"/>
-        <w:ind w:left="3138" w:right="3138" w:firstLine="0"/>
+        <w:ind w:left="3350" w:right="3350" w:firstLine="0"/>
         <w:jc w:val="center"/>
         <w:rPr>
           <w:rFonts w:ascii="Times New Roman" w:hAnsi="Times New Roman"/>
@@ -3213,6 +3277,14 @@
           <w:szCs w:val="2"/>
         </w:rPr>
       </w:pPr>
+      <w:r>
+        <w:rPr>
+          <w:rFonts w:ascii="Times New Roman" w:hAnsi="Times New Roman"/>
+          <w:sz w:val="2"/>
+          <w:szCs w:val="2"/>
+        </w:rPr>
+        <w:t xml:space="preserve"> </w:t>
+      </w:r>
     </w:p>
     <w:p>
       <w:pPr>
@@ -4080,7 +4152,7 @@
                 <w:between w:space="0" w:sz="0" w:val="nil"/>
               </w:pBdr>
               <w:shd w:fill="auto" w:val="clear"/>
-              <w:spacing w:after="0" w:before="0" w:line="360" w:lineRule="auto"/>
+              <w:spacing w:after="0" w:before="0" w:line="240" w:lineRule="auto"/>
               <w:ind w:left="0" w:right="0" w:firstLine="0"/>
               <w:jc w:val="center"/>
               <w:rPr>
@@ -4124,12 +4196,12 @@
               <w:pBdr>
                 <w:top w:space="0" w:sz="0" w:val="nil"/>
                 <w:left w:space="0" w:sz="0" w:val="nil"/>
-                <w:bottom w:space="1" w:sz="6" w:val="single" w:color="000000"/>
+                <w:bottom w:space="2" w:sz="6" w:val="single" w:color="000000"/>
                 <w:right w:space="0" w:sz="0" w:val="nil"/>
                 <w:between w:space="0" w:sz="0" w:val="nil"/>
               </w:pBdr>
               <w:spacing w:after="0" w:before="0" w:line="20" w:lineRule="auto"/>
-              <w:ind w:left="1145" w:right="1145" w:firstLine="0"/>
+              <w:ind w:left="1375" w:right="1375" w:firstLine="0"/>
               <w:jc w:val="center"/>
               <w:rPr>
                 <w:rFonts w:ascii="Times New Roman" w:hAnsi="Times New Roman"/>
@@ -4137,6 +4209,14 @@
                 <w:szCs w:val="2"/>
               </w:rPr>
             </w:pPr>
+            <w:r>
+              <w:rPr>
+                <w:rFonts w:ascii="Times New Roman" w:hAnsi="Times New Roman"/>
+                <w:sz w:val="2"/>
+                <w:szCs w:val="2"/>
+              </w:rPr>
+              <w:t xml:space="preserve"> </w:t>
+            </w:r>
           </w:p>
           <w:p>
             <w:pPr>
@@ -4241,7 +4321,7 @@
               <w:tabs>
                 <w:tab w:val="center" w:leader="none" w:pos="1620"/>
               </w:tabs>
-              <w:spacing w:after="0" w:before="0" w:line="360" w:lineRule="auto"/>
+              <w:spacing w:after="0" w:before="0" w:line="240" w:lineRule="auto"/>
               <w:ind w:left="0" w:right="0" w:firstLine="0"/>
               <w:jc w:val="center"/>
               <w:rPr>
@@ -4285,12 +4365,12 @@
               <w:pBdr>
                 <w:top w:space="0" w:sz="0" w:val="nil"/>
                 <w:left w:space="0" w:sz="0" w:val="nil"/>
-                <w:bottom w:space="4" w:sz="6" w:val="single" w:color="000000"/>
+                <w:bottom w:space="2" w:sz="6" w:val="single" w:color="000000"/>
                 <w:right w:space="0" w:sz="0" w:val="nil"/>
                 <w:between w:space="0" w:sz="0" w:val="nil"/>
               </w:pBdr>
               <w:spacing w:after="0" w:before="0" w:line="20" w:lineRule="auto"/>
-              <w:ind w:left="1102" w:right="1102" w:firstLine="0"/>
+              <w:ind w:left="1268" w:right="1268" w:firstLine="0"/>
               <w:jc w:val="center"/>
               <w:rPr>
                 <w:rFonts w:ascii="Times New Roman" w:hAnsi="Times New Roman"/>
@@ -4298,6 +4378,14 @@
                 <w:szCs w:val="2"/>
               </w:rPr>
             </w:pPr>
+            <w:r>
+              <w:rPr>
+                <w:rFonts w:ascii="Times New Roman" w:hAnsi="Times New Roman"/>
+                <w:sz w:val="2"/>
+                <w:szCs w:val="2"/>
+              </w:rPr>
+              <w:t xml:space="preserve"> </w:t>
+            </w:r>
           </w:p>
           <w:p>
             <w:pPr>
@@ -4494,12 +4582,12 @@
         <w:pBdr>
           <w:top w:space="0" w:sz="0" w:val="nil"/>
           <w:left w:space="0" w:sz="0" w:val="nil"/>
-          <w:bottom w:space="1" w:sz="6" w:val="single" w:color="000000"/>
+          <w:bottom w:space="2" w:sz="6" w:val="single" w:color="000000"/>
           <w:right w:space="0" w:sz="0" w:val="nil"/>
           <w:between w:space="0" w:sz="0" w:val="nil"/>
         </w:pBdr>
         <w:spacing w:after="0" w:before="0" w:line="20" w:lineRule="auto"/>
-        <w:ind w:left="3138" w:right="3138" w:firstLine="0"/>
+        <w:ind w:left="3350" w:right="3350" w:firstLine="0"/>
         <w:jc w:val="center"/>
         <w:rPr>
           <w:rFonts w:ascii="Times New Roman" w:hAnsi="Times New Roman"/>
@@ -4507,6 +4595,14 @@
           <w:szCs w:val="2"/>
         </w:rPr>
       </w:pPr>
+      <w:r>
+        <w:rPr>
+          <w:rFonts w:ascii="Times New Roman" w:hAnsi="Times New Roman"/>
+          <w:sz w:val="2"/>
+          <w:szCs w:val="2"/>
+        </w:rPr>
+        <w:t xml:space="preserve"> </w:t>
+      </w:r>
     </w:p>
     <w:p>
       <w:pPr>
@@ -5369,7 +5465,7 @@
                 <w:between w:space="0" w:sz="0" w:val="nil"/>
               </w:pBdr>
               <w:shd w:fill="auto" w:val="clear"/>
-              <w:spacing w:after="0" w:before="0" w:line="360" w:lineRule="auto"/>
+              <w:spacing w:after="0" w:before="0" w:line="240" w:lineRule="auto"/>
               <w:ind w:left="0" w:right="0" w:firstLine="0"/>
               <w:jc w:val="center"/>
               <w:rPr>
@@ -5413,12 +5509,12 @@
               <w:pBdr>
                 <w:top w:space="0" w:sz="0" w:val="nil"/>
                 <w:left w:space="0" w:sz="0" w:val="nil"/>
-                <w:bottom w:space="1" w:sz="6" w:val="single" w:color="000000"/>
+                <w:bottom w:space="2" w:sz="6" w:val="single" w:color="000000"/>
                 <w:right w:space="0" w:sz="0" w:val="nil"/>
                 <w:between w:space="0" w:sz="0" w:val="nil"/>
               </w:pBdr>
               <w:spacing w:after="0" w:before="0" w:line="20" w:lineRule="auto"/>
-              <w:ind w:left="1145" w:right="1145" w:firstLine="0"/>
+              <w:ind w:left="1375" w:right="1375" w:firstLine="0"/>
               <w:jc w:val="center"/>
               <w:rPr>
                 <w:rFonts w:ascii="Times New Roman" w:hAnsi="Times New Roman"/>
@@ -5426,6 +5522,14 @@
                 <w:szCs w:val="2"/>
               </w:rPr>
             </w:pPr>
+            <w:r>
+              <w:rPr>
+                <w:rFonts w:ascii="Times New Roman" w:hAnsi="Times New Roman"/>
+                <w:sz w:val="2"/>
+                <w:szCs w:val="2"/>
+              </w:rPr>
+              <w:t xml:space="preserve"> </w:t>
+            </w:r>
           </w:p>
           <w:p>
             <w:pPr>
@@ -5530,7 +5634,7 @@
               <w:tabs>
                 <w:tab w:val="center" w:leader="none" w:pos="1620"/>
               </w:tabs>
-              <w:spacing w:after="0" w:before="0" w:line="360" w:lineRule="auto"/>
+              <w:spacing w:after="0" w:before="0" w:line="240" w:lineRule="auto"/>
               <w:ind w:left="0" w:right="0" w:firstLine="0"/>
               <w:jc w:val="center"/>
               <w:rPr>
@@ -5574,12 +5678,12 @@
               <w:pBdr>
                 <w:top w:space="0" w:sz="0" w:val="nil"/>
                 <w:left w:space="0" w:sz="0" w:val="nil"/>
-                <w:bottom w:space="4" w:sz="6" w:val="single" w:color="000000"/>
+                <w:bottom w:space="2" w:sz="6" w:val="single" w:color="000000"/>
                 <w:right w:space="0" w:sz="0" w:val="nil"/>
                 <w:between w:space="0" w:sz="0" w:val="nil"/>
               </w:pBdr>
               <w:spacing w:after="0" w:before="0" w:line="20" w:lineRule="auto"/>
-              <w:ind w:left="1102" w:right="1102" w:firstLine="0"/>
+              <w:ind w:left="1268" w:right="1268" w:firstLine="0"/>
               <w:jc w:val="center"/>
               <w:rPr>
                 <w:rFonts w:ascii="Times New Roman" w:hAnsi="Times New Roman"/>
@@ -5587,6 +5691,14 @@
                 <w:szCs w:val="2"/>
               </w:rPr>
             </w:pPr>
+            <w:r>
+              <w:rPr>
+                <w:rFonts w:ascii="Times New Roman" w:hAnsi="Times New Roman"/>
+                <w:sz w:val="2"/>
+                <w:szCs w:val="2"/>
+              </w:rPr>
+              <w:t xml:space="preserve"> </w:t>
+            </w:r>
           </w:p>
           <w:p>
             <w:pPr>
@@ -5783,12 +5895,12 @@
         <w:pBdr>
           <w:top w:space="0" w:sz="0" w:val="nil"/>
           <w:left w:space="0" w:sz="0" w:val="nil"/>
-          <w:bottom w:space="1" w:sz="6" w:val="single" w:color="000000"/>
+          <w:bottom w:space="2" w:sz="6" w:val="single" w:color="000000"/>
           <w:right w:space="0" w:sz="0" w:val="nil"/>
           <w:between w:space="0" w:sz="0" w:val="nil"/>
         </w:pBdr>
         <w:spacing w:after="0" w:before="0" w:line="20" w:lineRule="auto"/>
-        <w:ind w:left="3138" w:right="3138" w:firstLine="0"/>
+        <w:ind w:left="3350" w:right="3350" w:firstLine="0"/>
         <w:jc w:val="center"/>
         <w:rPr>
           <w:rFonts w:ascii="Times New Roman" w:hAnsi="Times New Roman"/>
@@ -5796,6 +5908,14 @@
           <w:szCs w:val="2"/>
         </w:rPr>
       </w:pPr>
+      <w:r>
+        <w:rPr>
+          <w:rFonts w:ascii="Times New Roman" w:hAnsi="Times New Roman"/>
+          <w:sz w:val="2"/>
+          <w:szCs w:val="2"/>
+        </w:rPr>
+        <w:t xml:space="preserve"> </w:t>
+      </w:r>
     </w:p>
     <w:p>
       <w:pPr>
@@ -6658,7 +6778,7 @@
                 <w:between w:space="0" w:sz="0" w:val="nil"/>
               </w:pBdr>
               <w:shd w:fill="auto" w:val="clear"/>
-              <w:spacing w:after="0" w:before="0" w:line="360" w:lineRule="auto"/>
+              <w:spacing w:after="0" w:before="0" w:line="240" w:lineRule="auto"/>
               <w:ind w:left="0" w:right="0" w:firstLine="0"/>
               <w:jc w:val="center"/>
               <w:rPr>
@@ -6702,12 +6822,12 @@
               <w:pBdr>
                 <w:top w:space="0" w:sz="0" w:val="nil"/>
                 <w:left w:space="0" w:sz="0" w:val="nil"/>
-                <w:bottom w:space="1" w:sz="6" w:val="single" w:color="000000"/>
+                <w:bottom w:space="2" w:sz="6" w:val="single" w:color="000000"/>
                 <w:right w:space="0" w:sz="0" w:val="nil"/>
                 <w:between w:space="0" w:sz="0" w:val="nil"/>
               </w:pBdr>
               <w:spacing w:after="0" w:before="0" w:line="20" w:lineRule="auto"/>
-              <w:ind w:left="1145" w:right="1145" w:firstLine="0"/>
+              <w:ind w:left="1375" w:right="1375" w:firstLine="0"/>
               <w:jc w:val="center"/>
               <w:rPr>
                 <w:rFonts w:ascii="Times New Roman" w:hAnsi="Times New Roman"/>
@@ -6715,6 +6835,14 @@
                 <w:szCs w:val="2"/>
               </w:rPr>
             </w:pPr>
+            <w:r>
+              <w:rPr>
+                <w:rFonts w:ascii="Times New Roman" w:hAnsi="Times New Roman"/>
+                <w:sz w:val="2"/>
+                <w:szCs w:val="2"/>
+              </w:rPr>
+              <w:t xml:space="preserve"> </w:t>
+            </w:r>
           </w:p>
           <w:p>
             <w:pPr>
@@ -6819,7 +6947,7 @@
               <w:tabs>
                 <w:tab w:val="center" w:leader="none" w:pos="1620"/>
               </w:tabs>
-              <w:spacing w:after="0" w:before="0" w:line="360" w:lineRule="auto"/>
+              <w:spacing w:after="0" w:before="0" w:line="240" w:lineRule="auto"/>
               <w:ind w:left="0" w:right="0" w:firstLine="0"/>
               <w:jc w:val="center"/>
               <w:rPr>
@@ -6863,12 +6991,12 @@
               <w:pBdr>
                 <w:top w:space="0" w:sz="0" w:val="nil"/>
                 <w:left w:space="0" w:sz="0" w:val="nil"/>
-                <w:bottom w:space="4" w:sz="6" w:val="single" w:color="000000"/>
+                <w:bottom w:space="2" w:sz="6" w:val="single" w:color="000000"/>
                 <w:right w:space="0" w:sz="0" w:val="nil"/>
                 <w:between w:space="0" w:sz="0" w:val="nil"/>
               </w:pBdr>
               <w:spacing w:after="0" w:before="0" w:line="20" w:lineRule="auto"/>
-              <w:ind w:left="1102" w:right="1102" w:firstLine="0"/>
+              <w:ind w:left="1268" w:right="1268" w:firstLine="0"/>
               <w:jc w:val="center"/>
               <w:rPr>
                 <w:rFonts w:ascii="Times New Roman" w:hAnsi="Times New Roman"/>
@@ -6876,6 +7004,14 @@
                 <w:szCs w:val="2"/>
               </w:rPr>
             </w:pPr>
+            <w:r>
+              <w:rPr>
+                <w:rFonts w:ascii="Times New Roman" w:hAnsi="Times New Roman"/>
+                <w:sz w:val="2"/>
+                <w:szCs w:val="2"/>
+              </w:rPr>
+              <w:t xml:space="preserve"> </w:t>
+            </w:r>
           </w:p>
           <w:p>
             <w:pPr>
@@ -7072,12 +7208,12 @@
         <w:pBdr>
           <w:top w:space="0" w:sz="0" w:val="nil"/>
           <w:left w:space="0" w:sz="0" w:val="nil"/>
-          <w:bottom w:space="1" w:sz="6" w:val="single" w:color="000000"/>
+          <w:bottom w:space="2" w:sz="6" w:val="single" w:color="000000"/>
           <w:right w:space="0" w:sz="0" w:val="nil"/>
           <w:between w:space="0" w:sz="0" w:val="nil"/>
         </w:pBdr>
         <w:spacing w:after="0" w:before="0" w:line="20" w:lineRule="auto"/>
-        <w:ind w:left="3138" w:right="3138" w:firstLine="0"/>
+        <w:ind w:left="3350" w:right="3350" w:firstLine="0"/>
         <w:jc w:val="center"/>
         <w:rPr>
           <w:rFonts w:ascii="Times New Roman" w:hAnsi="Times New Roman"/>
@@ -7085,6 +7221,14 @@
           <w:szCs w:val="2"/>
         </w:rPr>
       </w:pPr>
+      <w:r>
+        <w:rPr>
+          <w:rFonts w:ascii="Times New Roman" w:hAnsi="Times New Roman"/>
+          <w:sz w:val="2"/>
+          <w:szCs w:val="2"/>
+        </w:rPr>
+        <w:t xml:space="preserve"> </w:t>
+      </w:r>
     </w:p>
     <w:p>
       <w:pPr>
@@ -7947,7 +8091,7 @@
                 <w:between w:space="0" w:sz="0" w:val="nil"/>
               </w:pBdr>
               <w:shd w:fill="auto" w:val="clear"/>
-              <w:spacing w:after="0" w:before="0" w:line="360" w:lineRule="auto"/>
+              <w:spacing w:after="0" w:before="0" w:line="240" w:lineRule="auto"/>
               <w:ind w:left="0" w:right="0" w:firstLine="0"/>
               <w:jc w:val="center"/>
               <w:rPr>
@@ -7991,12 +8135,12 @@
               <w:pBdr>
                 <w:top w:space="0" w:sz="0" w:val="nil"/>
                 <w:left w:space="0" w:sz="0" w:val="nil"/>
-                <w:bottom w:space="1" w:sz="6" w:val="single" w:color="000000"/>
+                <w:bottom w:space="2" w:sz="6" w:val="single" w:color="000000"/>
                 <w:right w:space="0" w:sz="0" w:val="nil"/>
                 <w:between w:space="0" w:sz="0" w:val="nil"/>
               </w:pBdr>
               <w:spacing w:after="0" w:before="0" w:line="20" w:lineRule="auto"/>
-              <w:ind w:left="1145" w:right="1145" w:firstLine="0"/>
+              <w:ind w:left="1375" w:right="1375" w:firstLine="0"/>
               <w:jc w:val="center"/>
               <w:rPr>
                 <w:rFonts w:ascii="Times New Roman" w:hAnsi="Times New Roman"/>
@@ -8004,6 +8148,14 @@
                 <w:szCs w:val="2"/>
               </w:rPr>
             </w:pPr>
+            <w:r>
+              <w:rPr>
+                <w:rFonts w:ascii="Times New Roman" w:hAnsi="Times New Roman"/>
+                <w:sz w:val="2"/>
+                <w:szCs w:val="2"/>
+              </w:rPr>
+              <w:t xml:space="preserve"> </w:t>
+            </w:r>
           </w:p>
           <w:p>
             <w:pPr>
@@ -8108,7 +8260,7 @@
               <w:tabs>
                 <w:tab w:val="center" w:leader="none" w:pos="1620"/>
               </w:tabs>
-              <w:spacing w:after="0" w:before="0" w:line="360" w:lineRule="auto"/>
+              <w:spacing w:after="0" w:before="0" w:line="240" w:lineRule="auto"/>
               <w:ind w:left="0" w:right="0" w:firstLine="0"/>
               <w:jc w:val="center"/>
               <w:rPr>
@@ -8152,12 +8304,12 @@
               <w:pBdr>
                 <w:top w:space="0" w:sz="0" w:val="nil"/>
                 <w:left w:space="0" w:sz="0" w:val="nil"/>
-                <w:bottom w:space="4" w:sz="6" w:val="single" w:color="000000"/>
+                <w:bottom w:space="2" w:sz="6" w:val="single" w:color="000000"/>
                 <w:right w:space="0" w:sz="0" w:val="nil"/>
                 <w:between w:space="0" w:sz="0" w:val="nil"/>
               </w:pBdr>
               <w:spacing w:after="0" w:before="0" w:line="20" w:lineRule="auto"/>
-              <w:ind w:left="1102" w:right="1102" w:firstLine="0"/>
+              <w:ind w:left="1268" w:right="1268" w:firstLine="0"/>
               <w:jc w:val="center"/>
               <w:rPr>
                 <w:rFonts w:ascii="Times New Roman" w:hAnsi="Times New Roman"/>
@@ -8165,6 +8317,14 @@
                 <w:szCs w:val="2"/>
               </w:rPr>
             </w:pPr>
+            <w:r>
+              <w:rPr>
+                <w:rFonts w:ascii="Times New Roman" w:hAnsi="Times New Roman"/>
+                <w:sz w:val="2"/>
+                <w:szCs w:val="2"/>
+              </w:rPr>
+              <w:t xml:space="preserve"> </w:t>
+            </w:r>
           </w:p>
           <w:p>
             <w:pPr>
@@ -8361,12 +8521,12 @@
         <w:pBdr>
           <w:top w:space="0" w:sz="0" w:val="nil"/>
           <w:left w:space="0" w:sz="0" w:val="nil"/>
-          <w:bottom w:space="1" w:sz="6" w:val="single" w:color="000000"/>
+          <w:bottom w:space="2" w:sz="6" w:val="single" w:color="000000"/>
           <w:right w:space="0" w:sz="0" w:val="nil"/>
           <w:between w:space="0" w:sz="0" w:val="nil"/>
         </w:pBdr>
         <w:spacing w:after="0" w:before="0" w:line="20" w:lineRule="auto"/>
-        <w:ind w:left="3138" w:right="3138" w:firstLine="0"/>
+        <w:ind w:left="3350" w:right="3350" w:firstLine="0"/>
         <w:jc w:val="center"/>
         <w:rPr>
           <w:rFonts w:ascii="Times New Roman" w:hAnsi="Times New Roman"/>
@@ -8374,6 +8534,14 @@
           <w:szCs w:val="2"/>
         </w:rPr>
       </w:pPr>
+      <w:r>
+        <w:rPr>
+          <w:rFonts w:ascii="Times New Roman" w:hAnsi="Times New Roman"/>
+          <w:sz w:val="2"/>
+          <w:szCs w:val="2"/>
+        </w:rPr>
+        <w:t xml:space="preserve"> </w:t>
+      </w:r>
     </w:p>
     <w:p>
       <w:pPr>
@@ -9262,7 +9430,7 @@
                 <w:between w:space="0" w:sz="0" w:val="nil"/>
               </w:pBdr>
               <w:shd w:fill="auto" w:val="clear"/>
-              <w:spacing w:after="0" w:before="0" w:line="360" w:lineRule="auto"/>
+              <w:spacing w:after="0" w:before="0" w:line="240" w:lineRule="auto"/>
               <w:ind w:left="0" w:right="0" w:firstLine="0"/>
               <w:jc w:val="center"/>
               <w:rPr>
@@ -9306,12 +9474,12 @@
               <w:pBdr>
                 <w:top w:space="0" w:sz="0" w:val="nil"/>
                 <w:left w:space="0" w:sz="0" w:val="nil"/>
-                <w:bottom w:space="1" w:sz="6" w:val="single" w:color="000000"/>
+                <w:bottom w:space="2" w:sz="6" w:val="single" w:color="000000"/>
                 <w:right w:space="0" w:sz="0" w:val="nil"/>
                 <w:between w:space="0" w:sz="0" w:val="nil"/>
               </w:pBdr>
               <w:spacing w:after="0" w:before="0" w:line="20" w:lineRule="auto"/>
-              <w:ind w:left="1145" w:right="1145" w:firstLine="0"/>
+              <w:ind w:left="1375" w:right="1375" w:firstLine="0"/>
               <w:jc w:val="center"/>
               <w:rPr>
                 <w:rFonts w:ascii="Times New Roman" w:hAnsi="Times New Roman"/>
@@ -9319,6 +9487,14 @@
                 <w:szCs w:val="2"/>
               </w:rPr>
             </w:pPr>
+            <w:r>
+              <w:rPr>
+                <w:rFonts w:ascii="Times New Roman" w:hAnsi="Times New Roman"/>
+                <w:sz w:val="2"/>
+                <w:szCs w:val="2"/>
+              </w:rPr>
+              <w:t xml:space="preserve"> </w:t>
+            </w:r>
           </w:p>
           <w:p>
             <w:pPr>
@@ -9423,7 +9599,7 @@
               <w:tabs>
                 <w:tab w:val="center" w:leader="none" w:pos="1620"/>
               </w:tabs>
-              <w:spacing w:after="0" w:before="0" w:line="360" w:lineRule="auto"/>
+              <w:spacing w:after="0" w:before="0" w:line="240" w:lineRule="auto"/>
               <w:ind w:left="0" w:right="0" w:firstLine="0"/>
               <w:jc w:val="center"/>
               <w:rPr>
@@ -9467,12 +9643,12 @@
               <w:pBdr>
                 <w:top w:space="0" w:sz="0" w:val="nil"/>
                 <w:left w:space="0" w:sz="0" w:val="nil"/>
-                <w:bottom w:space="4" w:sz="6" w:val="single" w:color="000000"/>
+                <w:bottom w:space="2" w:sz="6" w:val="single" w:color="000000"/>
                 <w:right w:space="0" w:sz="0" w:val="nil"/>
                 <w:between w:space="0" w:sz="0" w:val="nil"/>
               </w:pBdr>
               <w:spacing w:after="0" w:before="0" w:line="20" w:lineRule="auto"/>
-              <w:ind w:left="1102" w:right="1102" w:firstLine="0"/>
+              <w:ind w:left="1268" w:right="1268" w:firstLine="0"/>
               <w:jc w:val="center"/>
               <w:rPr>
                 <w:rFonts w:ascii="Times New Roman" w:hAnsi="Times New Roman"/>
@@ -9480,6 +9656,14 @@
                 <w:szCs w:val="2"/>
               </w:rPr>
             </w:pPr>
+            <w:r>
+              <w:rPr>
+                <w:rFonts w:ascii="Times New Roman" w:hAnsi="Times New Roman"/>
+                <w:sz w:val="2"/>
+                <w:szCs w:val="2"/>
+              </w:rPr>
+              <w:t xml:space="preserve"> </w:t>
+            </w:r>
           </w:p>
           <w:p>
             <w:pPr>
@@ -9678,12 +9862,12 @@
         <w:pBdr>
           <w:top w:space="0" w:sz="0" w:val="nil"/>
           <w:left w:space="0" w:sz="0" w:val="nil"/>
-          <w:bottom w:space="1" w:sz="6" w:val="single" w:color="000000"/>
+          <w:bottom w:space="2" w:sz="6" w:val="single" w:color="000000"/>
           <w:right w:space="0" w:sz="0" w:val="nil"/>
           <w:between w:space="0" w:sz="0" w:val="nil"/>
         </w:pBdr>
         <w:spacing w:after="0" w:before="0" w:line="20" w:lineRule="auto"/>
-        <w:ind w:left="3138" w:right="3138" w:firstLine="0"/>
+        <w:ind w:left="3350" w:right="3350" w:firstLine="0"/>
         <w:jc w:val="center"/>
         <w:rPr>
           <w:rFonts w:ascii="Times New Roman" w:hAnsi="Times New Roman"/>
@@ -9691,6 +9875,14 @@
           <w:szCs w:val="2"/>
         </w:rPr>
       </w:pPr>
+      <w:r>
+        <w:rPr>
+          <w:rFonts w:ascii="Times New Roman" w:hAnsi="Times New Roman"/>
+          <w:sz w:val="2"/>
+          <w:szCs w:val="2"/>
+        </w:rPr>
+        <w:t xml:space="preserve"> </w:t>
+      </w:r>
     </w:p>
     <w:p>
       <w:pPr>
@@ -10547,7 +10739,7 @@
                 <w:between w:space="0" w:sz="0" w:val="nil"/>
               </w:pBdr>
               <w:shd w:fill="auto" w:val="clear"/>
-              <w:spacing w:after="0" w:before="0" w:line="360" w:lineRule="auto"/>
+              <w:spacing w:after="0" w:before="0" w:line="240" w:lineRule="auto"/>
               <w:ind w:left="0" w:right="0" w:firstLine="0"/>
               <w:jc w:val="center"/>
               <w:rPr>
@@ -10591,12 +10783,12 @@
               <w:pBdr>
                 <w:top w:space="0" w:sz="0" w:val="nil"/>
                 <w:left w:space="0" w:sz="0" w:val="nil"/>
-                <w:bottom w:space="1" w:sz="6" w:val="single" w:color="000000"/>
+                <w:bottom w:space="2" w:sz="6" w:val="single" w:color="000000"/>
                 <w:right w:space="0" w:sz="0" w:val="nil"/>
                 <w:between w:space="0" w:sz="0" w:val="nil"/>
               </w:pBdr>
               <w:spacing w:after="0" w:before="0" w:line="20" w:lineRule="auto"/>
-              <w:ind w:left="1145" w:right="1145" w:firstLine="0"/>
+              <w:ind w:left="1375" w:right="1375" w:firstLine="0"/>
               <w:jc w:val="center"/>
               <w:rPr>
                 <w:rFonts w:ascii="Times New Roman" w:hAnsi="Times New Roman"/>
@@ -10604,6 +10796,14 @@
                 <w:szCs w:val="2"/>
               </w:rPr>
             </w:pPr>
+            <w:r>
+              <w:rPr>
+                <w:rFonts w:ascii="Times New Roman" w:hAnsi="Times New Roman"/>
+                <w:sz w:val="2"/>
+                <w:szCs w:val="2"/>
+              </w:rPr>
+              <w:t xml:space="preserve"> </w:t>
+            </w:r>
           </w:p>
           <w:p>
             <w:pPr>
@@ -10708,7 +10908,7 @@
               <w:tabs>
                 <w:tab w:val="center" w:leader="none" w:pos="1620"/>
               </w:tabs>
-              <w:spacing w:after="0" w:before="0" w:line="360" w:lineRule="auto"/>
+              <w:spacing w:after="0" w:before="0" w:line="240" w:lineRule="auto"/>
               <w:ind w:left="0" w:right="0" w:firstLine="0"/>
               <w:jc w:val="center"/>
               <w:rPr>
@@ -10752,12 +10952,12 @@
               <w:pBdr>
                 <w:top w:space="0" w:sz="0" w:val="nil"/>
                 <w:left w:space="0" w:sz="0" w:val="nil"/>
-                <w:bottom w:space="4" w:sz="6" w:val="single" w:color="000000"/>
+                <w:bottom w:space="2" w:sz="6" w:val="single" w:color="000000"/>
                 <w:right w:space="0" w:sz="0" w:val="nil"/>
                 <w:between w:space="0" w:sz="0" w:val="nil"/>
               </w:pBdr>
               <w:spacing w:after="0" w:before="0" w:line="20" w:lineRule="auto"/>
-              <w:ind w:left="1102" w:right="1102" w:firstLine="0"/>
+              <w:ind w:left="1268" w:right="1268" w:firstLine="0"/>
               <w:jc w:val="center"/>
               <w:rPr>
                 <w:rFonts w:ascii="Times New Roman" w:hAnsi="Times New Roman"/>
@@ -10765,6 +10965,14 @@
                 <w:szCs w:val="2"/>
               </w:rPr>
             </w:pPr>
+            <w:r>
+              <w:rPr>
+                <w:rFonts w:ascii="Times New Roman" w:hAnsi="Times New Roman"/>
+                <w:sz w:val="2"/>
+                <w:szCs w:val="2"/>
+              </w:rPr>
+              <w:t xml:space="preserve"> </w:t>
+            </w:r>
           </w:p>
           <w:p>
             <w:pPr>
@@ -10961,12 +11169,12 @@
         <w:pBdr>
           <w:top w:space="0" w:sz="0" w:val="nil"/>
           <w:left w:space="0" w:sz="0" w:val="nil"/>
-          <w:bottom w:space="1" w:sz="6" w:val="single" w:color="000000"/>
+          <w:bottom w:space="2" w:sz="6" w:val="single" w:color="000000"/>
           <w:right w:space="0" w:sz="0" w:val="nil"/>
           <w:between w:space="0" w:sz="0" w:val="nil"/>
         </w:pBdr>
         <w:spacing w:after="0" w:before="0" w:line="20" w:lineRule="auto"/>
-        <w:ind w:left="3138" w:right="3138" w:firstLine="0"/>
+        <w:ind w:left="3350" w:right="3350" w:firstLine="0"/>
         <w:jc w:val="center"/>
         <w:rPr>
           <w:rFonts w:ascii="Times New Roman" w:hAnsi="Times New Roman"/>
@@ -10974,6 +11182,14 @@
           <w:szCs w:val="2"/>
         </w:rPr>
       </w:pPr>
+      <w:r>
+        <w:rPr>
+          <w:rFonts w:ascii="Times New Roman" w:hAnsi="Times New Roman"/>
+          <w:sz w:val="2"/>
+          <w:szCs w:val="2"/>
+        </w:rPr>
+        <w:t xml:space="preserve"> </w:t>
+      </w:r>
     </w:p>
     <w:p>
       <w:pPr>

</xml_diff>